<commit_message>
Propagate Sefaria fixes to 3 Sefer Editions (08-09, 08-16, 08-30) + add persistent Sefaria Corrections Log at repo root
</commit_message>
<xml_diff>
--- a/sefer-edition/book-rewrites/2026-08-09 — Entering Shabbos Shacharis — Sefer Edition — styled.docx
+++ b/sefer-edition/book-rewrites/2026-08-09 — Entering Shabbos Shacharis — Sefer Edition — styled.docx
@@ -262,7 +262,7 @@
           <w:color w:val="3B3B3B"/>
           <w:sz w:val="22"/>
         </w:rPr>
-        <w:t>Zohar HaKadosh</w:t>
+        <w:t>Teshuvas HaGeonim</w:t>
       </w:r>
       <w:r>
         <w:rPr>
@@ -272,7 +272,47 @@
           <w:color w:val="3B3B3B"/>
           <w:sz w:val="22"/>
         </w:rPr>
-        <w:t xml:space="preserve"> that </w:t>
+        <w:t xml:space="preserve"> (brought in </w:t>
+      </w:r>
+      <w:r>
+        <w:rPr>
+          <w:rFonts w:ascii="Georgia" w:hAnsi="Georgia" w:cs="SBL Hebrew" w:eastAsia="Georgia"/>
+          <w:b w:val="0"/>
+          <w:i/>
+          <w:color w:val="3B3B3B"/>
+          <w:sz w:val="22"/>
+        </w:rPr>
+        <w:t>Tosafos Sanhedrin</w:t>
+      </w:r>
+      <w:r>
+        <w:rPr>
+          <w:rFonts w:ascii="Georgia" w:hAnsi="Georgia" w:cs="SBL Hebrew" w:eastAsia="Georgia"/>
+          <w:b w:val="0"/>
+          <w:i/>
+          <w:color w:val="3B3B3B"/>
+          <w:sz w:val="22"/>
+        </w:rPr>
+        <w:t xml:space="preserve"> </w:t>
+      </w:r>
+      <w:r>
+        <w:rPr>
+          <w:rFonts w:ascii="SBL Hebrew" w:hAnsi="SBL Hebrew" w:cs="SBL Hebrew" w:eastAsia="SBL Hebrew"/>
+          <w:b w:val="0"/>
+          <w:i/>
+          <w:color w:val="1E3A8A"/>
+          <w:sz w:val="22"/>
+        </w:rPr>
+        <w:t>ל”ז ע”ב</w:t>
+      </w:r>
+      <w:r>
+        <w:rPr>
+          <w:rFonts w:ascii="Georgia" w:hAnsi="Georgia" w:cs="SBL Hebrew" w:eastAsia="Georgia"/>
+          <w:b w:val="0"/>
+          <w:i/>
+          <w:color w:val="3B3B3B"/>
+          <w:sz w:val="22"/>
+        </w:rPr>
+        <w:t xml:space="preserve">) that </w:t>
       </w:r>
       <w:r>
         <w:rPr>
@@ -8249,6 +8289,86 @@
           <w:color w:val="1A1A1A"/>
           <w:sz w:val="22"/>
         </w:rPr>
+        <w:t>Ramo</w:t>
+      </w:r>
+      <w:r>
+        <w:rPr>
+          <w:rFonts w:ascii="Georgia" w:hAnsi="Georgia" w:cs="SBL Hebrew" w:eastAsia="Georgia"/>
+          <w:b w:val="0"/>
+          <w:i w:val="0"/>
+          <w:color w:val="1A1A1A"/>
+          <w:sz w:val="22"/>
+        </w:rPr>
+        <w:t xml:space="preserve"> in </w:t>
+      </w:r>
+      <w:r>
+        <w:rPr>
+          <w:rFonts w:ascii="Georgia" w:hAnsi="Georgia" w:cs="SBL Hebrew" w:eastAsia="Georgia"/>
+          <w:b w:val="0"/>
+          <w:i/>
+          <w:color w:val="1A1A1A"/>
+          <w:sz w:val="22"/>
+        </w:rPr>
+        <w:t>Orach Chaim</w:t>
+      </w:r>
+      <w:r>
+        <w:rPr>
+          <w:rFonts w:ascii="Georgia" w:hAnsi="Georgia" w:cs="SBL Hebrew" w:eastAsia="Georgia"/>
+          <w:b w:val="0"/>
+          <w:i w:val="0"/>
+          <w:color w:val="1A1A1A"/>
+          <w:sz w:val="22"/>
+        </w:rPr>
+        <w:t xml:space="preserve"> </w:t>
+      </w:r>
+      <w:r>
+        <w:rPr>
+          <w:rFonts w:ascii="SBL Hebrew" w:hAnsi="SBL Hebrew" w:cs="SBL Hebrew" w:eastAsia="SBL Hebrew"/>
+          <w:b w:val="0"/>
+          <w:i w:val="0"/>
+          <w:color w:val="1E3A8A"/>
+          <w:sz w:val="22"/>
+        </w:rPr>
+        <w:t>רפ”א:א</w:t>
+      </w:r>
+      <w:r>
+        <w:rPr>
+          <w:rFonts w:ascii="Georgia" w:hAnsi="Georgia" w:cs="SBL Hebrew" w:eastAsia="Georgia"/>
+          <w:b w:val="0"/>
+          <w:i w:val="0"/>
+          <w:color w:val="1A1A1A"/>
+          <w:sz w:val="22"/>
+        </w:rPr>
+        <w:t xml:space="preserve">, citing the </w:t>
+      </w:r>
+      <w:r>
+        <w:rPr>
+          <w:rFonts w:ascii="Georgia" w:hAnsi="Georgia" w:cs="SBL Hebrew" w:eastAsia="Georgia"/>
+          <w:b w:val="0"/>
+          <w:i/>
+          <w:color w:val="1A1A1A"/>
+          <w:sz w:val="22"/>
+        </w:rPr>
+        <w:t>Or Zarua</w:t>
+      </w:r>
+      <w:r>
+        <w:rPr>
+          <w:rFonts w:ascii="Georgia" w:hAnsi="Georgia" w:cs="SBL Hebrew" w:eastAsia="Georgia"/>
+          <w:b w:val="0"/>
+          <w:i w:val="0"/>
+          <w:color w:val="1A1A1A"/>
+          <w:sz w:val="22"/>
+        </w:rPr>
+        <w:t xml:space="preserve">, issues a striking guard against the impatient congregant, and the </w:t>
+      </w:r>
+      <w:r>
+        <w:rPr>
+          <w:rFonts w:ascii="Georgia" w:hAnsi="Georgia" w:cs="SBL Hebrew" w:eastAsia="Georgia"/>
+          <w:b w:val="0"/>
+          <w:i/>
+          <w:color w:val="1A1A1A"/>
+          <w:sz w:val="22"/>
+        </w:rPr>
         <w:t>Mishnah Berurah</w:t>
       </w:r>
       <w:r>
@@ -8259,7 +8379,7 @@
           <w:color w:val="1A1A1A"/>
           <w:sz w:val="22"/>
         </w:rPr>
-        <w:t xml:space="preserve"> issues a striking guard against the impatient congregant.</w:t>
+        <w:t xml:space="preserve"> codifies the ruling in its wake.</w:t>
       </w:r>
       <w:r>
         <w:rPr>
@@ -8428,17 +8548,17 @@
           <w:color w:val="1A1A1A"/>
           <w:sz w:val="22"/>
         </w:rPr>
-        <w:t>Mishnah Berurah</w:t>
-      </w:r>
-      <w:r>
-        <w:rPr>
-          <w:rFonts w:ascii="Georgia" w:hAnsi="Georgia" w:cs="SBL Hebrew" w:eastAsia="Georgia"/>
-          <w:b w:val="0"/>
-          <w:i w:val="0"/>
-          <w:color w:val="1A1A1A"/>
-          <w:sz w:val="22"/>
-        </w:rPr>
-        <w:t xml:space="preserve"> writes that this protest is prohibited </w:t>
+        <w:t>Ramo</w:t>
+      </w:r>
+      <w:r>
+        <w:rPr>
+          <w:rFonts w:ascii="Georgia" w:hAnsi="Georgia" w:cs="SBL Hebrew" w:eastAsia="Georgia"/>
+          <w:b w:val="0"/>
+          <w:i w:val="0"/>
+          <w:color w:val="1A1A1A"/>
+          <w:sz w:val="22"/>
+        </w:rPr>
+        <w:t xml:space="preserve"> rules that this protest is prohibited </w:t>
       </w:r>
       <w:r>
         <w:rPr>
@@ -10128,7 +10248,7 @@
           <w:color w:val="B8860B"/>
           <w:sz w:val="23"/>
         </w:rPr>
-        <w:t>The Zohar in Tosafos</w:t>
+        <w:t>The Teshuvas HaGeonim in Tosafos</w:t>
       </w:r>
     </w:p>
     <w:p>
@@ -10193,7 +10313,7 @@
           <w:color w:val="1A1A1A"/>
           <w:sz w:val="22"/>
         </w:rPr>
-        <w:t>Zohar HaKadosh</w:t>
+        <w:t>Teshuvas HaGeonim</w:t>
       </w:r>
       <w:r>
         <w:rPr>
@@ -10213,7 +10333,7 @@
           <w:color w:val="1A1A1A"/>
           <w:sz w:val="22"/>
         </w:rPr>
-        <w:t>זֹהַר הַקָּדוֹשׁ</w:t>
+        <w:t>תְּשׁוּבַת הַגְּאוֹנִים</w:t>
       </w:r>
       <w:r>
         <w:rPr>
@@ -10254,6 +10374,26 @@
           <w:sz w:val="22"/>
         </w:rPr>
         <w:t>Sanhedrin</w:t>
+      </w:r>
+      <w:r>
+        <w:rPr>
+          <w:rFonts w:ascii="Georgia" w:hAnsi="Georgia" w:cs="SBL Hebrew" w:eastAsia="Georgia"/>
+          <w:b w:val="0"/>
+          <w:i w:val="0"/>
+          <w:color w:val="1A1A1A"/>
+          <w:sz w:val="22"/>
+        </w:rPr>
+        <w:t xml:space="preserve"> </w:t>
+      </w:r>
+      <w:r>
+        <w:rPr>
+          <w:rFonts w:ascii="SBL Hebrew" w:hAnsi="SBL Hebrew" w:cs="SBL Hebrew" w:eastAsia="SBL Hebrew"/>
+          <w:b w:val="0"/>
+          <w:i w:val="0"/>
+          <w:color w:val="1E3A8A"/>
+          <w:sz w:val="22"/>
+        </w:rPr>
+        <w:t>ל”ז ע”ב</w:t>
       </w:r>
       <w:r>
         <w:rPr>
@@ -10382,7 +10522,7 @@
           <w:color w:val="1A1A1A"/>
           <w:sz w:val="22"/>
         </w:rPr>
-        <w:t xml:space="preserve"> — six wings, six wings for each. Each of the six wings, in the Zoharic teaching, is the vehicle of the </w:t>
+        <w:t xml:space="preserve"> — six wings, six wings for each. Each of the six wings, in this Geonic teaching, is the vehicle of the </w:t>
       </w:r>
       <w:r>
         <w:rPr>
@@ -10422,7 +10562,167 @@
           <w:color w:val="1A1A1A"/>
           <w:sz w:val="22"/>
         </w:rPr>
-        <w:t>) song on one day of the week: Sunday one wing, Monday another, through the six days of creation.</w:t>
+        <w:t xml:space="preserve">) song on one day of the week: Sunday one wing, Monday another, through the six days of creation. The seventh-wing derivation is anchored in </w:t>
+      </w:r>
+      <w:r>
+        <w:rPr>
+          <w:rFonts w:ascii="Georgia" w:hAnsi="Georgia" w:cs="SBL Hebrew" w:eastAsia="Georgia"/>
+          <w:b w:val="0"/>
+          <w:i/>
+          <w:color w:val="1A1A1A"/>
+          <w:sz w:val="22"/>
+        </w:rPr>
+        <w:t>Yeshayahu</w:t>
+      </w:r>
+      <w:r>
+        <w:rPr>
+          <w:rFonts w:ascii="Georgia" w:hAnsi="Georgia" w:cs="SBL Hebrew" w:eastAsia="Georgia"/>
+          <w:b w:val="0"/>
+          <w:i w:val="0"/>
+          <w:color w:val="1A1A1A"/>
+          <w:sz w:val="22"/>
+        </w:rPr>
+        <w:t xml:space="preserve"> 24:16 — </w:t>
+      </w:r>
+      <w:r>
+        <w:rPr>
+          <w:rFonts w:ascii="SBL Hebrew" w:hAnsi="SBL Hebrew" w:cs="SBL Hebrew" w:eastAsia="SBL Hebrew"/>
+          <w:b w:val="0"/>
+          <w:i w:val="0"/>
+          <w:color w:val="1E3A8A"/>
+          <w:sz w:val="22"/>
+        </w:rPr>
+        <w:t>“מִכְּנַף הָאָרֶץ זְמִרֹת שָׁמַעְנוּ”</w:t>
+      </w:r>
+      <w:r>
+        <w:rPr>
+          <w:rFonts w:ascii="Georgia" w:hAnsi="Georgia" w:cs="SBL Hebrew" w:eastAsia="Georgia"/>
+          <w:b w:val="0"/>
+          <w:i w:val="0"/>
+          <w:color w:val="1A1A1A"/>
+          <w:sz w:val="22"/>
+        </w:rPr>
+        <w:t xml:space="preserve"> — read as the song of </w:t>
+      </w:r>
+      <w:r>
+        <w:rPr>
+          <w:rFonts w:ascii="Georgia" w:hAnsi="Georgia" w:cs="SBL Hebrew" w:eastAsia="Georgia"/>
+          <w:b w:val="0"/>
+          <w:i/>
+          <w:color w:val="1A1A1A"/>
+          <w:sz w:val="22"/>
+        </w:rPr>
+        <w:t>Klal Yisrael</w:t>
+      </w:r>
+      <w:r>
+        <w:rPr>
+          <w:rFonts w:ascii="Georgia" w:hAnsi="Georgia" w:cs="SBL Hebrew" w:eastAsia="Georgia"/>
+          <w:b w:val="0"/>
+          <w:i w:val="0"/>
+          <w:color w:val="1A1A1A"/>
+          <w:sz w:val="22"/>
+        </w:rPr>
+        <w:t xml:space="preserve"> supplying the wing that the </w:t>
+      </w:r>
+      <w:r>
+        <w:rPr>
+          <w:rFonts w:ascii="Georgia" w:hAnsi="Georgia" w:cs="SBL Hebrew" w:eastAsia="Georgia"/>
+          <w:b w:val="0"/>
+          <w:i/>
+          <w:color w:val="1A1A1A"/>
+          <w:sz w:val="22"/>
+        </w:rPr>
+        <w:t>Serafim</w:t>
+      </w:r>
+      <w:r>
+        <w:rPr>
+          <w:rFonts w:ascii="Georgia" w:hAnsi="Georgia" w:cs="SBL Hebrew" w:eastAsia="Georgia"/>
+          <w:b w:val="0"/>
+          <w:i w:val="0"/>
+          <w:color w:val="1A1A1A"/>
+          <w:sz w:val="22"/>
+        </w:rPr>
+        <w:t xml:space="preserve"> lack. [Corrected via Sefaria: source is </w:t>
+      </w:r>
+      <w:r>
+        <w:rPr>
+          <w:rFonts w:ascii="Georgia" w:hAnsi="Georgia" w:cs="SBL Hebrew" w:eastAsia="Georgia"/>
+          <w:b w:val="0"/>
+          <w:i/>
+          <w:color w:val="1A1A1A"/>
+          <w:sz w:val="22"/>
+        </w:rPr>
+        <w:t>Teshuvas HaGeonim</w:t>
+      </w:r>
+      <w:r>
+        <w:rPr>
+          <w:rFonts w:ascii="Georgia" w:hAnsi="Georgia" w:cs="SBL Hebrew" w:eastAsia="Georgia"/>
+          <w:b w:val="0"/>
+          <w:i w:val="0"/>
+          <w:color w:val="1A1A1A"/>
+          <w:sz w:val="22"/>
+        </w:rPr>
+        <w:t xml:space="preserve"> brought in </w:t>
+      </w:r>
+      <w:r>
+        <w:rPr>
+          <w:rFonts w:ascii="Georgia" w:hAnsi="Georgia" w:cs="SBL Hebrew" w:eastAsia="Georgia"/>
+          <w:b w:val="0"/>
+          <w:i/>
+          <w:color w:val="1A1A1A"/>
+          <w:sz w:val="22"/>
+        </w:rPr>
+        <w:t>Tosafos Sanhedrin</w:t>
+      </w:r>
+      <w:r>
+        <w:rPr>
+          <w:rFonts w:ascii="Georgia" w:hAnsi="Georgia" w:cs="SBL Hebrew" w:eastAsia="Georgia"/>
+          <w:b w:val="0"/>
+          <w:i w:val="0"/>
+          <w:color w:val="1A1A1A"/>
+          <w:sz w:val="22"/>
+        </w:rPr>
+        <w:t xml:space="preserve"> </w:t>
+      </w:r>
+      <w:r>
+        <w:rPr>
+          <w:rFonts w:ascii="SBL Hebrew" w:hAnsi="SBL Hebrew" w:cs="SBL Hebrew" w:eastAsia="SBL Hebrew"/>
+          <w:b w:val="0"/>
+          <w:i w:val="0"/>
+          <w:color w:val="1E3A8A"/>
+          <w:sz w:val="22"/>
+        </w:rPr>
+        <w:t>ל”ז ע”ב</w:t>
+      </w:r>
+      <w:r>
+        <w:rPr>
+          <w:rFonts w:ascii="Georgia" w:hAnsi="Georgia" w:cs="SBL Hebrew" w:eastAsia="Georgia"/>
+          <w:b w:val="0"/>
+          <w:i w:val="0"/>
+          <w:color w:val="1A1A1A"/>
+          <w:sz w:val="22"/>
+        </w:rPr>
+        <w:t xml:space="preserve">, not the </w:t>
+      </w:r>
+      <w:r>
+        <w:rPr>
+          <w:rFonts w:ascii="Georgia" w:hAnsi="Georgia" w:cs="SBL Hebrew" w:eastAsia="Georgia"/>
+          <w:b w:val="0"/>
+          <w:i/>
+          <w:color w:val="1A1A1A"/>
+          <w:sz w:val="22"/>
+        </w:rPr>
+        <w:t>Zohar</w:t>
+      </w:r>
+      <w:r>
+        <w:rPr>
+          <w:rFonts w:ascii="Georgia" w:hAnsi="Georgia" w:cs="SBL Hebrew" w:eastAsia="Georgia"/>
+          <w:b w:val="0"/>
+          <w:i w:val="0"/>
+          <w:color w:val="1A1A1A"/>
+          <w:sz w:val="22"/>
+        </w:rPr>
+        <w:t>.]</w:t>
       </w:r>
     </w:p>
     <w:p>
@@ -12128,7 +12428,7 @@
           <w:color w:val="1A1A1A"/>
           <w:sz w:val="22"/>
         </w:rPr>
-        <w:t>Zoharic</w:t>
+        <w:t>Teshuvas HaGeonim</w:t>
       </w:r>
       <w:r>
         <w:rPr>
@@ -17190,7 +17490,47 @@
           <w:color w:val="1A1A1A"/>
           <w:sz w:val="21"/>
         </w:rPr>
-        <w:t xml:space="preserve">’s gloss records the </w:t>
+        <w:t xml:space="preserve">’s gloss on </w:t>
+      </w:r>
+      <w:r>
+        <w:rPr>
+          <w:rFonts w:ascii="Georgia" w:hAnsi="Georgia" w:cs="SBL Hebrew" w:eastAsia="Georgia"/>
+          <w:b w:val="0"/>
+          <w:i/>
+          <w:color w:val="1A1A1A"/>
+          <w:sz w:val="21"/>
+        </w:rPr>
+        <w:t>Orach Chaim</w:t>
+      </w:r>
+      <w:r>
+        <w:rPr>
+          <w:rFonts w:ascii="Georgia" w:hAnsi="Georgia" w:cs="SBL Hebrew" w:eastAsia="Georgia"/>
+          <w:b w:val="0"/>
+          <w:i w:val="0"/>
+          <w:color w:val="1A1A1A"/>
+          <w:sz w:val="21"/>
+        </w:rPr>
+        <w:t xml:space="preserve"> </w:t>
+      </w:r>
+      <w:r>
+        <w:rPr>
+          <w:rFonts w:ascii="SBL Hebrew" w:hAnsi="SBL Hebrew" w:cs="SBL Hebrew" w:eastAsia="SBL Hebrew"/>
+          <w:b w:val="0"/>
+          <w:i w:val="0"/>
+          <w:color w:val="1E3A8A"/>
+          <w:sz w:val="21"/>
+        </w:rPr>
+        <w:t>רפ”א:א</w:t>
+      </w:r>
+      <w:r>
+        <w:rPr>
+          <w:rFonts w:ascii="Georgia" w:hAnsi="Georgia" w:cs="SBL Hebrew" w:eastAsia="Georgia"/>
+          <w:b w:val="0"/>
+          <w:i w:val="0"/>
+          <w:color w:val="1A1A1A"/>
+          <w:sz w:val="21"/>
+        </w:rPr>
+        <w:t xml:space="preserve"> records the </w:t>
       </w:r>
       <w:r>
         <w:rPr>
@@ -17230,7 +17570,27 @@
           <w:color w:val="1A1A1A"/>
           <w:sz w:val="21"/>
         </w:rPr>
-        <w:t xml:space="preserve"> of Shabbos somewhat later than during the week. He does not specify how much later, and gives no reason in the siman itself; the reasoning is developed in the earlier Rishonic sources (fn 16–17) and in the later </w:t>
+        <w:t xml:space="preserve"> of Shabbos somewhat later than during the week, with a parenthetical citation to the </w:t>
+      </w:r>
+      <w:r>
+        <w:rPr>
+          <w:rFonts w:ascii="Georgia" w:hAnsi="Georgia" w:cs="SBL Hebrew" w:eastAsia="Georgia"/>
+          <w:b w:val="0"/>
+          <w:i/>
+          <w:color w:val="1A1A1A"/>
+          <w:sz w:val="21"/>
+        </w:rPr>
+        <w:t>Mordechai</w:t>
+      </w:r>
+      <w:r>
+        <w:rPr>
+          <w:rFonts w:ascii="Georgia" w:hAnsi="Georgia" w:cs="SBL Hebrew" w:eastAsia="Georgia"/>
+          <w:b w:val="0"/>
+          <w:i w:val="0"/>
+          <w:color w:val="1A1A1A"/>
+          <w:sz w:val="21"/>
+        </w:rPr>
+        <w:t xml:space="preserve"> (fn 16). He does not specify how much later, and gives no reason in the siman itself; the reasoning is developed in the earlier Rishonic sources (fn 16–17) and in the later </w:t>
       </w:r>
       <w:r>
         <w:rPr>
@@ -19892,6 +20252,66 @@
           <w:color w:val="1A1A1A"/>
           <w:sz w:val="21"/>
         </w:rPr>
+        <w:t>Ramo, Orach Chaim</w:t>
+      </w:r>
+      <w:r>
+        <w:rPr>
+          <w:rFonts w:ascii="Georgia" w:hAnsi="Georgia" w:cs="SBL Hebrew" w:eastAsia="Georgia"/>
+          <w:b w:val="0"/>
+          <w:i w:val="0"/>
+          <w:color w:val="1A1A1A"/>
+          <w:sz w:val="21"/>
+        </w:rPr>
+        <w:t xml:space="preserve"> </w:t>
+      </w:r>
+      <w:r>
+        <w:rPr>
+          <w:rFonts w:ascii="SBL Hebrew" w:hAnsi="SBL Hebrew" w:cs="SBL Hebrew" w:eastAsia="SBL Hebrew"/>
+          <w:b w:val="0"/>
+          <w:i w:val="0"/>
+          <w:color w:val="1E3A8A"/>
+          <w:sz w:val="21"/>
+        </w:rPr>
+        <w:t>רפ”א:א</w:t>
+      </w:r>
+      <w:r>
+        <w:rPr>
+          <w:rFonts w:ascii="Georgia" w:hAnsi="Georgia" w:cs="SBL Hebrew" w:eastAsia="Georgia"/>
+          <w:b w:val="0"/>
+          <w:i w:val="0"/>
+          <w:color w:val="1A1A1A"/>
+          <w:sz w:val="21"/>
+        </w:rPr>
+        <w:t xml:space="preserve"> in the name of the </w:t>
+      </w:r>
+      <w:r>
+        <w:rPr>
+          <w:rFonts w:ascii="Georgia" w:hAnsi="Georgia" w:cs="SBL Hebrew" w:eastAsia="Georgia"/>
+          <w:b w:val="0"/>
+          <w:i/>
+          <w:color w:val="1A1A1A"/>
+          <w:sz w:val="21"/>
+        </w:rPr>
+        <w:t>Or Zarua</w:t>
+      </w:r>
+      <w:r>
+        <w:rPr>
+          <w:rFonts w:ascii="Georgia" w:hAnsi="Georgia" w:cs="SBL Hebrew" w:eastAsia="Georgia"/>
+          <w:b w:val="0"/>
+          <w:i w:val="0"/>
+          <w:color w:val="1A1A1A"/>
+          <w:sz w:val="21"/>
+        </w:rPr>
+        <w:t xml:space="preserve">; codified in </w:t>
+      </w:r>
+      <w:r>
+        <w:rPr>
+          <w:rFonts w:ascii="Georgia" w:hAnsi="Georgia" w:cs="SBL Hebrew" w:eastAsia="Georgia"/>
+          <w:b w:val="0"/>
+          <w:i/>
+          <w:color w:val="1A1A1A"/>
+          <w:sz w:val="21"/>
+        </w:rPr>
         <w:t>Mishnah Berurah</w:t>
       </w:r>
       <w:r>
@@ -19902,7 +20322,25 @@
           <w:color w:val="1A1A1A"/>
           <w:sz w:val="21"/>
         </w:rPr>
-        <w:t xml:space="preserve">, prohibition of pressuring the </w:t>
+        <w:t xml:space="preserve"> ad loc.</w:t>
+      </w:r>
+      <w:r>
+        <w:rPr>
+          <w:rFonts w:ascii="Georgia" w:hAnsi="Georgia" w:cs="SBL Hebrew" w:eastAsia="Georgia"/>
+          <w:color w:val="1A1A1A"/>
+          <w:sz w:val="21"/>
+        </w:rPr>
+        <w:t xml:space="preserve"> </w:t>
+      </w:r>
+      <w:r>
+        <w:rPr>
+          <w:rFonts w:ascii="Georgia" w:hAnsi="Georgia" w:cs="SBL Hebrew" w:eastAsia="Georgia"/>
+          <w:b w:val="0"/>
+          <w:i w:val="0"/>
+          <w:color w:val="1A1A1A"/>
+          <w:sz w:val="21"/>
+        </w:rPr>
+        <w:t xml:space="preserve">— The primary source of the prohibition against pressuring the </w:t>
       </w:r>
       <w:r>
         <w:rPr>
@@ -19922,11 +20360,43 @@
           <w:color w:val="1A1A1A"/>
           <w:sz w:val="21"/>
         </w:rPr>
-        <w:t>.</w:t>
-      </w:r>
-      <w:r>
-        <w:rPr>
-          <w:rFonts w:ascii="Georgia" w:hAnsi="Georgia" w:cs="SBL Hebrew" w:eastAsia="Georgia"/>
+        <w:t xml:space="preserve"> to speed up on Shabbos morning is the </w:t>
+      </w:r>
+      <w:r>
+        <w:rPr>
+          <w:rFonts w:ascii="Georgia" w:hAnsi="Georgia" w:cs="SBL Hebrew" w:eastAsia="Georgia"/>
+          <w:b w:val="0"/>
+          <w:i/>
+          <w:color w:val="1A1A1A"/>
+          <w:sz w:val="21"/>
+        </w:rPr>
+        <w:t>Ramo</w:t>
+      </w:r>
+      <w:r>
+        <w:rPr>
+          <w:rFonts w:ascii="Georgia" w:hAnsi="Georgia" w:cs="SBL Hebrew" w:eastAsia="Georgia"/>
+          <w:b w:val="0"/>
+          <w:i w:val="0"/>
+          <w:color w:val="1A1A1A"/>
+          <w:sz w:val="21"/>
+        </w:rPr>
+        <w:t xml:space="preserve"> in </w:t>
+      </w:r>
+      <w:r>
+        <w:rPr>
+          <w:rFonts w:ascii="Georgia" w:hAnsi="Georgia" w:cs="SBL Hebrew" w:eastAsia="Georgia"/>
+          <w:b w:val="0"/>
+          <w:i/>
+          <w:color w:val="1A1A1A"/>
+          <w:sz w:val="21"/>
+        </w:rPr>
+        <w:t>Orach Chaim</w:t>
+      </w:r>
+      <w:r>
+        <w:rPr>
+          <w:rFonts w:ascii="Georgia" w:hAnsi="Georgia" w:cs="SBL Hebrew" w:eastAsia="Georgia"/>
+          <w:b w:val="0"/>
+          <w:i w:val="0"/>
           <w:color w:val="1A1A1A"/>
           <w:sz w:val="21"/>
         </w:rPr>
@@ -19934,13 +20404,63 @@
       </w:r>
       <w:r>
         <w:rPr>
-          <w:rFonts w:ascii="Georgia" w:hAnsi="Georgia" w:cs="SBL Hebrew" w:eastAsia="Georgia"/>
-          <w:b w:val="0"/>
-          <w:i w:val="0"/>
-          <w:color w:val="1A1A1A"/>
-          <w:sz w:val="21"/>
-        </w:rPr>
-        <w:t xml:space="preserve">— The </w:t>
+          <w:rFonts w:ascii="SBL Hebrew" w:hAnsi="SBL Hebrew" w:cs="SBL Hebrew" w:eastAsia="SBL Hebrew"/>
+          <w:b w:val="0"/>
+          <w:i w:val="0"/>
+          <w:color w:val="1E3A8A"/>
+          <w:sz w:val="21"/>
+        </w:rPr>
+        <w:t>רפ”א:א</w:t>
+      </w:r>
+      <w:r>
+        <w:rPr>
+          <w:rFonts w:ascii="Georgia" w:hAnsi="Georgia" w:cs="SBL Hebrew" w:eastAsia="Georgia"/>
+          <w:b w:val="0"/>
+          <w:i w:val="0"/>
+          <w:color w:val="1A1A1A"/>
+          <w:sz w:val="21"/>
+        </w:rPr>
+        <w:t xml:space="preserve">, citing the </w:t>
+      </w:r>
+      <w:r>
+        <w:rPr>
+          <w:rFonts w:ascii="Georgia" w:hAnsi="Georgia" w:cs="SBL Hebrew" w:eastAsia="Georgia"/>
+          <w:b w:val="0"/>
+          <w:i/>
+          <w:color w:val="1A1A1A"/>
+          <w:sz w:val="21"/>
+        </w:rPr>
+        <w:t>Or Zarua</w:t>
+      </w:r>
+      <w:r>
+        <w:rPr>
+          <w:rFonts w:ascii="Georgia" w:hAnsi="Georgia" w:cs="SBL Hebrew" w:eastAsia="Georgia"/>
+          <w:b w:val="0"/>
+          <w:i w:val="0"/>
+          <w:color w:val="1A1A1A"/>
+          <w:sz w:val="21"/>
+        </w:rPr>
+        <w:t xml:space="preserve">: even if the protester’s motive is </w:t>
+      </w:r>
+      <w:r>
+        <w:rPr>
+          <w:rFonts w:ascii="Georgia" w:hAnsi="Georgia" w:cs="SBL Hebrew" w:eastAsia="Georgia"/>
+          <w:b w:val="0"/>
+          <w:i/>
+          <w:color w:val="1A1A1A"/>
+          <w:sz w:val="21"/>
+        </w:rPr>
+        <w:t>l’shem shamayim</w:t>
+      </w:r>
+      <w:r>
+        <w:rPr>
+          <w:rFonts w:ascii="Georgia" w:hAnsi="Georgia" w:cs="SBL Hebrew" w:eastAsia="Georgia"/>
+          <w:b w:val="0"/>
+          <w:i w:val="0"/>
+          <w:color w:val="1A1A1A"/>
+          <w:sz w:val="21"/>
+        </w:rPr>
+        <w:t xml:space="preserve">, the protest is forbidden. The </w:t>
       </w:r>
       <w:r>
         <w:rPr>
@@ -19960,7 +20480,127 @@
           <w:color w:val="1A1A1A"/>
           <w:sz w:val="21"/>
         </w:rPr>
-        <w:t xml:space="preserve"> rules that if the </w:t>
+        <w:t xml:space="preserve"> codifies the ruling in its wake (also in </w:t>
+      </w:r>
+      <w:r>
+        <w:rPr>
+          <w:rFonts w:ascii="Georgia" w:hAnsi="Georgia" w:cs="SBL Hebrew" w:eastAsia="Georgia"/>
+          <w:b w:val="0"/>
+          <w:i/>
+          <w:color w:val="1A1A1A"/>
+          <w:sz w:val="21"/>
+        </w:rPr>
+        <w:t>siman</w:t>
+      </w:r>
+      <w:r>
+        <w:rPr>
+          <w:rFonts w:ascii="Georgia" w:hAnsi="Georgia" w:cs="SBL Hebrew" w:eastAsia="Georgia"/>
+          <w:b w:val="0"/>
+          <w:i w:val="0"/>
+          <w:color w:val="1A1A1A"/>
+          <w:sz w:val="21"/>
+        </w:rPr>
+        <w:t xml:space="preserve"> </w:t>
+      </w:r>
+      <w:r>
+        <w:rPr>
+          <w:rFonts w:ascii="SBL Hebrew" w:hAnsi="SBL Hebrew" w:cs="SBL Hebrew" w:eastAsia="SBL Hebrew"/>
+          <w:b w:val="0"/>
+          <w:i w:val="0"/>
+          <w:color w:val="1E3A8A"/>
+          <w:sz w:val="21"/>
+        </w:rPr>
+        <w:t>נ”א</w:t>
+      </w:r>
+      <w:r>
+        <w:rPr>
+          <w:rFonts w:ascii="Georgia" w:hAnsi="Georgia" w:cs="SBL Hebrew" w:eastAsia="Georgia"/>
+          <w:b w:val="0"/>
+          <w:i w:val="0"/>
+          <w:color w:val="1A1A1A"/>
+          <w:sz w:val="21"/>
+        </w:rPr>
+        <w:t xml:space="preserve"> in the general discussion of </w:t>
+      </w:r>
+      <w:r>
+        <w:rPr>
+          <w:rFonts w:ascii="Georgia" w:hAnsi="Georgia" w:cs="SBL Hebrew" w:eastAsia="Georgia"/>
+          <w:b w:val="0"/>
+          <w:i/>
+          <w:color w:val="1A1A1A"/>
+          <w:sz w:val="21"/>
+        </w:rPr>
+        <w:t>Pesukei d’Zimra</w:t>
+      </w:r>
+      <w:r>
+        <w:rPr>
+          <w:rFonts w:ascii="Georgia" w:hAnsi="Georgia" w:cs="SBL Hebrew" w:eastAsia="Georgia"/>
+          <w:b w:val="0"/>
+          <w:i w:val="0"/>
+          <w:color w:val="1A1A1A"/>
+          <w:sz w:val="21"/>
+        </w:rPr>
+        <w:t xml:space="preserve">). The </w:t>
+      </w:r>
+      <w:r>
+        <w:rPr>
+          <w:rFonts w:ascii="Georgia" w:hAnsi="Georgia" w:cs="SBL Hebrew" w:eastAsia="Georgia"/>
+          <w:b w:val="0"/>
+          <w:i/>
+          <w:color w:val="1A1A1A"/>
+          <w:sz w:val="21"/>
+        </w:rPr>
+        <w:t>ikkar din</w:t>
+      </w:r>
+      <w:r>
+        <w:rPr>
+          <w:rFonts w:ascii="Georgia" w:hAnsi="Georgia" w:cs="SBL Hebrew" w:eastAsia="Georgia"/>
+          <w:b w:val="0"/>
+          <w:i w:val="0"/>
+          <w:color w:val="1A1A1A"/>
+          <w:sz w:val="21"/>
+        </w:rPr>
+        <w:t xml:space="preserve"> is that </w:t>
+      </w:r>
+      <w:r>
+        <w:rPr>
+          <w:rFonts w:ascii="Georgia" w:hAnsi="Georgia" w:cs="SBL Hebrew" w:eastAsia="Georgia"/>
+          <w:b w:val="0"/>
+          <w:i/>
+          <w:color w:val="1A1A1A"/>
+          <w:sz w:val="21"/>
+        </w:rPr>
+        <w:t>Pesukei d’Zimra</w:t>
+      </w:r>
+      <w:r>
+        <w:rPr>
+          <w:rFonts w:ascii="Georgia" w:hAnsi="Georgia" w:cs="SBL Hebrew" w:eastAsia="Georgia"/>
+          <w:b w:val="0"/>
+          <w:i w:val="0"/>
+          <w:color w:val="1A1A1A"/>
+          <w:sz w:val="21"/>
+        </w:rPr>
+        <w:t xml:space="preserve"> is to be said </w:t>
+      </w:r>
+      <w:r>
+        <w:rPr>
+          <w:rFonts w:ascii="Georgia" w:hAnsi="Georgia" w:cs="SBL Hebrew" w:eastAsia="Georgia"/>
+          <w:b w:val="0"/>
+          <w:i/>
+          <w:color w:val="1A1A1A"/>
+          <w:sz w:val="21"/>
+        </w:rPr>
+        <w:t>b’nachas u’b’kavvanah</w:t>
+      </w:r>
+      <w:r>
+        <w:rPr>
+          <w:rFonts w:ascii="Georgia" w:hAnsi="Georgia" w:cs="SBL Hebrew" w:eastAsia="Georgia"/>
+          <w:b w:val="0"/>
+          <w:i w:val="0"/>
+          <w:color w:val="1A1A1A"/>
+          <w:sz w:val="21"/>
+        </w:rPr>
+        <w:t xml:space="preserve">, and the Shabbos-morning latitude for the </w:t>
       </w:r>
       <w:r>
         <w:rPr>
@@ -19980,7 +20620,7 @@
           <w:color w:val="1A1A1A"/>
           <w:sz w:val="21"/>
         </w:rPr>
-        <w:t xml:space="preserve"> is </w:t>
+        <w:t xml:space="preserve"> to be </w:t>
       </w:r>
       <w:r>
         <w:rPr>
@@ -20000,227 +20640,67 @@
           <w:color w:val="1A1A1A"/>
           <w:sz w:val="21"/>
         </w:rPr>
-        <w:t xml:space="preserve"> in </w:t>
-      </w:r>
-      <w:r>
-        <w:rPr>
-          <w:rFonts w:ascii="Georgia" w:hAnsi="Georgia" w:cs="SBL Hebrew" w:eastAsia="Georgia"/>
-          <w:b w:val="0"/>
-          <w:i/>
-          <w:color w:val="1A1A1A"/>
-          <w:sz w:val="21"/>
-        </w:rPr>
-        <w:t>Pesukei d’Zimra</w:t>
-      </w:r>
-      <w:r>
-        <w:rPr>
-          <w:rFonts w:ascii="Georgia" w:hAnsi="Georgia" w:cs="SBL Hebrew" w:eastAsia="Georgia"/>
-          <w:b w:val="0"/>
-          <w:i w:val="0"/>
-          <w:color w:val="1A1A1A"/>
-          <w:sz w:val="21"/>
-        </w:rPr>
-        <w:t xml:space="preserve">, a member of the </w:t>
-      </w:r>
-      <w:r>
-        <w:rPr>
-          <w:rFonts w:ascii="Georgia" w:hAnsi="Georgia" w:cs="SBL Hebrew" w:eastAsia="Georgia"/>
-          <w:b w:val="0"/>
-          <w:i/>
-          <w:color w:val="1A1A1A"/>
-          <w:sz w:val="21"/>
-        </w:rPr>
-        <w:t>tzibbur</w:t>
-      </w:r>
-      <w:r>
-        <w:rPr>
-          <w:rFonts w:ascii="Georgia" w:hAnsi="Georgia" w:cs="SBL Hebrew" w:eastAsia="Georgia"/>
-          <w:b w:val="0"/>
-          <w:i w:val="0"/>
-          <w:color w:val="1A1A1A"/>
-          <w:sz w:val="21"/>
-        </w:rPr>
-        <w:t xml:space="preserve"> may not protest even </w:t>
-      </w:r>
-      <w:r>
-        <w:rPr>
-          <w:rFonts w:ascii="Georgia" w:hAnsi="Georgia" w:cs="SBL Hebrew" w:eastAsia="Georgia"/>
-          <w:b w:val="0"/>
-          <w:i/>
-          <w:color w:val="1A1A1A"/>
-          <w:sz w:val="21"/>
-        </w:rPr>
-        <w:t>l’shem shamayim</w:t>
-      </w:r>
-      <w:r>
-        <w:rPr>
-          <w:rFonts w:ascii="Georgia" w:hAnsi="Georgia" w:cs="SBL Hebrew" w:eastAsia="Georgia"/>
-          <w:b w:val="0"/>
-          <w:i w:val="0"/>
-          <w:color w:val="1A1A1A"/>
-          <w:sz w:val="21"/>
-        </w:rPr>
-        <w:t xml:space="preserve">. The </w:t>
-      </w:r>
-      <w:r>
-        <w:rPr>
-          <w:rFonts w:ascii="Georgia" w:hAnsi="Georgia" w:cs="SBL Hebrew" w:eastAsia="Georgia"/>
-          <w:b w:val="0"/>
-          <w:i/>
-          <w:color w:val="1A1A1A"/>
-          <w:sz w:val="21"/>
-        </w:rPr>
-        <w:t>ikkar din</w:t>
-      </w:r>
-      <w:r>
-        <w:rPr>
-          <w:rFonts w:ascii="Georgia" w:hAnsi="Georgia" w:cs="SBL Hebrew" w:eastAsia="Georgia"/>
-          <w:b w:val="0"/>
-          <w:i w:val="0"/>
-          <w:color w:val="1A1A1A"/>
-          <w:sz w:val="21"/>
-        </w:rPr>
-        <w:t xml:space="preserve"> is that </w:t>
-      </w:r>
-      <w:r>
-        <w:rPr>
-          <w:rFonts w:ascii="Georgia" w:hAnsi="Georgia" w:cs="SBL Hebrew" w:eastAsia="Georgia"/>
-          <w:b w:val="0"/>
-          <w:i/>
-          <w:color w:val="1A1A1A"/>
-          <w:sz w:val="21"/>
-        </w:rPr>
-        <w:t>Pesukei d’Zimra</w:t>
-      </w:r>
-      <w:r>
-        <w:rPr>
-          <w:rFonts w:ascii="Georgia" w:hAnsi="Georgia" w:cs="SBL Hebrew" w:eastAsia="Georgia"/>
-          <w:b w:val="0"/>
-          <w:i w:val="0"/>
-          <w:color w:val="1A1A1A"/>
-          <w:sz w:val="21"/>
-        </w:rPr>
-        <w:t xml:space="preserve"> is to be said </w:t>
-      </w:r>
-      <w:r>
-        <w:rPr>
-          <w:rFonts w:ascii="Georgia" w:hAnsi="Georgia" w:cs="SBL Hebrew" w:eastAsia="Georgia"/>
-          <w:b w:val="0"/>
-          <w:i/>
-          <w:color w:val="1A1A1A"/>
-          <w:sz w:val="21"/>
-        </w:rPr>
-        <w:t>b’nachas u’b’kavvanah</w:t>
-      </w:r>
-      <w:r>
-        <w:rPr>
-          <w:rFonts w:ascii="Georgia" w:hAnsi="Georgia" w:cs="SBL Hebrew" w:eastAsia="Georgia"/>
-          <w:b w:val="0"/>
-          <w:i w:val="0"/>
-          <w:color w:val="1A1A1A"/>
-          <w:sz w:val="21"/>
-        </w:rPr>
-        <w:t xml:space="preserve">, and the Shabbos-morning latitude for the </w:t>
-      </w:r>
-      <w:r>
-        <w:rPr>
-          <w:rFonts w:ascii="Georgia" w:hAnsi="Georgia" w:cs="SBL Hebrew" w:eastAsia="Georgia"/>
-          <w:b w:val="0"/>
-          <w:i/>
-          <w:color w:val="1A1A1A"/>
-          <w:sz w:val="21"/>
-        </w:rPr>
-        <w:t>shaliach tzibbur</w:t>
-      </w:r>
-      <w:r>
-        <w:rPr>
-          <w:rFonts w:ascii="Georgia" w:hAnsi="Georgia" w:cs="SBL Hebrew" w:eastAsia="Georgia"/>
-          <w:b w:val="0"/>
-          <w:i w:val="0"/>
-          <w:color w:val="1A1A1A"/>
-          <w:sz w:val="21"/>
-        </w:rPr>
-        <w:t xml:space="preserve"> to be </w:t>
-      </w:r>
-      <w:r>
-        <w:rPr>
-          <w:rFonts w:ascii="Georgia" w:hAnsi="Georgia" w:cs="SBL Hebrew" w:eastAsia="Georgia"/>
-          <w:b w:val="0"/>
-          <w:i/>
-          <w:color w:val="1A1A1A"/>
-          <w:sz w:val="21"/>
-        </w:rPr>
-        <w:t>ma’arich</w:t>
-      </w:r>
-      <w:r>
-        <w:rPr>
-          <w:rFonts w:ascii="Georgia" w:hAnsi="Georgia" w:cs="SBL Hebrew" w:eastAsia="Georgia"/>
-          <w:b w:val="0"/>
-          <w:i w:val="0"/>
-          <w:color w:val="1A1A1A"/>
-          <w:sz w:val="21"/>
-        </w:rPr>
-        <w:t xml:space="preserve"> is halakhically established. The ruling appears in the general discussion of </w:t>
-      </w:r>
-      <w:r>
-        <w:rPr>
-          <w:rFonts w:ascii="Georgia" w:hAnsi="Georgia" w:cs="SBL Hebrew" w:eastAsia="Georgia"/>
-          <w:b w:val="0"/>
-          <w:i/>
-          <w:color w:val="1A1A1A"/>
-          <w:sz w:val="21"/>
-        </w:rPr>
-        <w:t>Pesukei d’Zimra</w:t>
-      </w:r>
-      <w:r>
-        <w:rPr>
-          <w:rFonts w:ascii="Georgia" w:hAnsi="Georgia" w:cs="SBL Hebrew" w:eastAsia="Georgia"/>
-          <w:b w:val="0"/>
-          <w:i w:val="0"/>
-          <w:color w:val="1A1A1A"/>
-          <w:sz w:val="21"/>
-        </w:rPr>
-        <w:t xml:space="preserve"> in </w:t>
-      </w:r>
-      <w:r>
-        <w:rPr>
-          <w:rFonts w:ascii="Georgia" w:hAnsi="Georgia" w:cs="SBL Hebrew" w:eastAsia="Georgia"/>
-          <w:b w:val="0"/>
-          <w:i/>
-          <w:color w:val="1A1A1A"/>
-          <w:sz w:val="21"/>
-        </w:rPr>
-        <w:t>siman</w:t>
-      </w:r>
-      <w:r>
-        <w:rPr>
-          <w:rFonts w:ascii="Georgia" w:hAnsi="Georgia" w:cs="SBL Hebrew" w:eastAsia="Georgia"/>
-          <w:b w:val="0"/>
-          <w:i w:val="0"/>
-          <w:color w:val="1A1A1A"/>
-          <w:sz w:val="21"/>
-        </w:rPr>
-        <w:t xml:space="preserve"> </w:t>
-      </w:r>
-      <w:r>
-        <w:rPr>
-          <w:rFonts w:ascii="SBL Hebrew" w:hAnsi="SBL Hebrew" w:cs="SBL Hebrew" w:eastAsia="SBL Hebrew"/>
-          <w:b w:val="0"/>
-          <w:i w:val="0"/>
-          <w:color w:val="1E3A8A"/>
-          <w:sz w:val="21"/>
-        </w:rPr>
-        <w:t>נ”א</w:t>
-      </w:r>
-      <w:r>
-        <w:rPr>
-          <w:rFonts w:ascii="Georgia" w:hAnsi="Georgia" w:cs="SBL Hebrew" w:eastAsia="Georgia"/>
-          <w:b w:val="0"/>
-          <w:i w:val="0"/>
-          <w:color w:val="1A1A1A"/>
-          <w:sz w:val="21"/>
-        </w:rPr>
-        <w:t xml:space="preserve"> and following.</w:t>
+        <w:t xml:space="preserve"> is halakhically established. [Corrected via Sefaria: primary attribution is </w:t>
+      </w:r>
+      <w:r>
+        <w:rPr>
+          <w:rFonts w:ascii="Georgia" w:hAnsi="Georgia" w:cs="SBL Hebrew" w:eastAsia="Georgia"/>
+          <w:b w:val="0"/>
+          <w:i/>
+          <w:color w:val="1A1A1A"/>
+          <w:sz w:val="21"/>
+        </w:rPr>
+        <w:t>Ramo</w:t>
+      </w:r>
+      <w:r>
+        <w:rPr>
+          <w:rFonts w:ascii="Georgia" w:hAnsi="Georgia" w:cs="SBL Hebrew" w:eastAsia="Georgia"/>
+          <w:b w:val="0"/>
+          <w:i w:val="0"/>
+          <w:color w:val="1A1A1A"/>
+          <w:sz w:val="21"/>
+        </w:rPr>
+        <w:t>/</w:t>
+      </w:r>
+      <w:r>
+        <w:rPr>
+          <w:rFonts w:ascii="Georgia" w:hAnsi="Georgia" w:cs="SBL Hebrew" w:eastAsia="Georgia"/>
+          <w:b w:val="0"/>
+          <w:i/>
+          <w:color w:val="1A1A1A"/>
+          <w:sz w:val="21"/>
+        </w:rPr>
+        <w:t>Or Zarua</w:t>
+      </w:r>
+      <w:r>
+        <w:rPr>
+          <w:rFonts w:ascii="Georgia" w:hAnsi="Georgia" w:cs="SBL Hebrew" w:eastAsia="Georgia"/>
+          <w:b w:val="0"/>
+          <w:i w:val="0"/>
+          <w:color w:val="1A1A1A"/>
+          <w:sz w:val="21"/>
+        </w:rPr>
+        <w:t xml:space="preserve">, not </w:t>
+      </w:r>
+      <w:r>
+        <w:rPr>
+          <w:rFonts w:ascii="Georgia" w:hAnsi="Georgia" w:cs="SBL Hebrew" w:eastAsia="Georgia"/>
+          <w:b w:val="0"/>
+          <w:i/>
+          <w:color w:val="1A1A1A"/>
+          <w:sz w:val="21"/>
+        </w:rPr>
+        <w:t>Mishnah Berurah</w:t>
+      </w:r>
+      <w:r>
+        <w:rPr>
+          <w:rFonts w:ascii="Georgia" w:hAnsi="Georgia" w:cs="SBL Hebrew" w:eastAsia="Georgia"/>
+          <w:b w:val="0"/>
+          <w:i w:val="0"/>
+          <w:color w:val="1A1A1A"/>
+          <w:sz w:val="21"/>
+        </w:rPr>
+        <w:t>.]</w:t>
       </w:r>
       <w:r>
         <w:rPr>
@@ -20879,11 +21359,21 @@
         <w:rPr>
           <w:rFonts w:ascii="Georgia" w:hAnsi="Georgia" w:cs="SBL Hebrew" w:eastAsia="Georgia"/>
           <w:b w:val="0"/>
-          <w:i w:val="0"/>
-          <w:color w:val="1A1A1A"/>
-          <w:sz w:val="21"/>
-        </w:rPr>
-        <w:t xml:space="preserve">Zohar cited in </w:t>
+          <w:i/>
+          <w:color w:val="1A1A1A"/>
+          <w:sz w:val="21"/>
+        </w:rPr>
+        <w:t>Teshuvas HaGeonim</w:t>
+      </w:r>
+      <w:r>
+        <w:rPr>
+          <w:rFonts w:ascii="Georgia" w:hAnsi="Georgia" w:cs="SBL Hebrew" w:eastAsia="Georgia"/>
+          <w:b w:val="0"/>
+          <w:i w:val="0"/>
+          <w:color w:val="1A1A1A"/>
+          <w:sz w:val="21"/>
+        </w:rPr>
+        <w:t xml:space="preserve"> cited in </w:t>
       </w:r>
       <w:r>
         <w:rPr>
@@ -20913,7 +21403,7 @@
           <w:color w:val="1E3A8A"/>
           <w:sz w:val="21"/>
         </w:rPr>
-        <w:t>ל”ז</w:t>
+        <w:t>ל”ז ע”ב</w:t>
       </w:r>
       <w:r>
         <w:rPr>
@@ -20943,7 +21433,47 @@
           <w:color w:val="1A1A1A"/>
           <w:sz w:val="21"/>
         </w:rPr>
-        <w:t xml:space="preserve"> 6:2.</w:t>
+        <w:t xml:space="preserve"> 6:2 and 24:16. [Corrected via Sefaria: source is </w:t>
+      </w:r>
+      <w:r>
+        <w:rPr>
+          <w:rFonts w:ascii="Georgia" w:hAnsi="Georgia" w:cs="SBL Hebrew" w:eastAsia="Georgia"/>
+          <w:b w:val="0"/>
+          <w:i/>
+          <w:color w:val="1A1A1A"/>
+          <w:sz w:val="21"/>
+        </w:rPr>
+        <w:t>Teshuvas HaGeonim</w:t>
+      </w:r>
+      <w:r>
+        <w:rPr>
+          <w:rFonts w:ascii="Georgia" w:hAnsi="Georgia" w:cs="SBL Hebrew" w:eastAsia="Georgia"/>
+          <w:b w:val="0"/>
+          <w:i w:val="0"/>
+          <w:color w:val="1A1A1A"/>
+          <w:sz w:val="21"/>
+        </w:rPr>
+        <w:t xml:space="preserve">, not the </w:t>
+      </w:r>
+      <w:r>
+        <w:rPr>
+          <w:rFonts w:ascii="Georgia" w:hAnsi="Georgia" w:cs="SBL Hebrew" w:eastAsia="Georgia"/>
+          <w:b w:val="0"/>
+          <w:i/>
+          <w:color w:val="1A1A1A"/>
+          <w:sz w:val="21"/>
+        </w:rPr>
+        <w:t>Zohar</w:t>
+      </w:r>
+      <w:r>
+        <w:rPr>
+          <w:rFonts w:ascii="Georgia" w:hAnsi="Georgia" w:cs="SBL Hebrew" w:eastAsia="Georgia"/>
+          <w:b w:val="0"/>
+          <w:i w:val="0"/>
+          <w:color w:val="1A1A1A"/>
+          <w:sz w:val="21"/>
+        </w:rPr>
+        <w:t>.]</w:t>
       </w:r>
       <w:r>
         <w:rPr>
@@ -21011,37 +21541,37 @@
           <w:color w:val="1E3A8A"/>
           <w:sz w:val="21"/>
         </w:rPr>
-        <w:t>ל”ז</w:t>
-      </w:r>
-      <w:r>
-        <w:rPr>
-          <w:rFonts w:ascii="Georgia" w:hAnsi="Georgia" w:cs="SBL Hebrew" w:eastAsia="Georgia"/>
-          <w:b w:val="0"/>
-          <w:i w:val="0"/>
-          <w:color w:val="1A1A1A"/>
-          <w:sz w:val="21"/>
-        </w:rPr>
-        <w:t xml:space="preserve"> brings the </w:t>
-      </w:r>
-      <w:r>
-        <w:rPr>
-          <w:rFonts w:ascii="Georgia" w:hAnsi="Georgia" w:cs="SBL Hebrew" w:eastAsia="Georgia"/>
-          <w:b w:val="0"/>
-          <w:i/>
-          <w:color w:val="1A1A1A"/>
-          <w:sz w:val="21"/>
-        </w:rPr>
-        <w:t>Zoharic</w:t>
-      </w:r>
-      <w:r>
-        <w:rPr>
-          <w:rFonts w:ascii="Georgia" w:hAnsi="Georgia" w:cs="SBL Hebrew" w:eastAsia="Georgia"/>
-          <w:b w:val="0"/>
-          <w:i w:val="0"/>
-          <w:color w:val="1A1A1A"/>
-          <w:sz w:val="21"/>
-        </w:rPr>
-        <w:t xml:space="preserve"> teaching on the six wings of the </w:t>
+        <w:t>ל”ז ע”ב</w:t>
+      </w:r>
+      <w:r>
+        <w:rPr>
+          <w:rFonts w:ascii="Georgia" w:hAnsi="Georgia" w:cs="SBL Hebrew" w:eastAsia="Georgia"/>
+          <w:b w:val="0"/>
+          <w:i w:val="0"/>
+          <w:color w:val="1A1A1A"/>
+          <w:sz w:val="21"/>
+        </w:rPr>
+        <w:t xml:space="preserve"> brings, in the name of the </w:t>
+      </w:r>
+      <w:r>
+        <w:rPr>
+          <w:rFonts w:ascii="Georgia" w:hAnsi="Georgia" w:cs="SBL Hebrew" w:eastAsia="Georgia"/>
+          <w:b w:val="0"/>
+          <w:i/>
+          <w:color w:val="1A1A1A"/>
+          <w:sz w:val="21"/>
+        </w:rPr>
+        <w:t>Teshuvas HaGeonim</w:t>
+      </w:r>
+      <w:r>
+        <w:rPr>
+          <w:rFonts w:ascii="Georgia" w:hAnsi="Georgia" w:cs="SBL Hebrew" w:eastAsia="Georgia"/>
+          <w:b w:val="0"/>
+          <w:i w:val="0"/>
+          <w:color w:val="1A1A1A"/>
+          <w:sz w:val="21"/>
+        </w:rPr>
+        <w:t xml:space="preserve">, the teaching on the six wings of the </w:t>
       </w:r>
       <w:r>
         <w:rPr>
@@ -21061,7 +21591,27 @@
           <w:color w:val="1A1A1A"/>
           <w:sz w:val="21"/>
         </w:rPr>
-        <w:t xml:space="preserve">. Full pasuk: </w:t>
+        <w:t>. Full pasuk (</w:t>
+      </w:r>
+      <w:r>
+        <w:rPr>
+          <w:rFonts w:ascii="Georgia" w:hAnsi="Georgia" w:cs="SBL Hebrew" w:eastAsia="Georgia"/>
+          <w:b w:val="0"/>
+          <w:i/>
+          <w:color w:val="1A1A1A"/>
+          <w:sz w:val="21"/>
+        </w:rPr>
+        <w:t>Yeshayahu</w:t>
+      </w:r>
+      <w:r>
+        <w:rPr>
+          <w:rFonts w:ascii="Georgia" w:hAnsi="Georgia" w:cs="SBL Hebrew" w:eastAsia="Georgia"/>
+          <w:b w:val="0"/>
+          <w:i w:val="0"/>
+          <w:color w:val="1A1A1A"/>
+          <w:sz w:val="21"/>
+        </w:rPr>
+        <w:t xml:space="preserve"> 6:2): </w:t>
       </w:r>
       <w:r>
         <w:rPr>
@@ -21141,7 +21691,67 @@
           <w:color w:val="1A1A1A"/>
           <w:sz w:val="21"/>
         </w:rPr>
-        <w:t xml:space="preserve">, the seventh wing. The added </w:t>
+        <w:t xml:space="preserve">, the seventh wing. The pasuk-derivation for the seventh wing is </w:t>
+      </w:r>
+      <w:r>
+        <w:rPr>
+          <w:rFonts w:ascii="Georgia" w:hAnsi="Georgia" w:cs="SBL Hebrew" w:eastAsia="Georgia"/>
+          <w:b w:val="0"/>
+          <w:i/>
+          <w:color w:val="1A1A1A"/>
+          <w:sz w:val="21"/>
+        </w:rPr>
+        <w:t>Yeshayahu</w:t>
+      </w:r>
+      <w:r>
+        <w:rPr>
+          <w:rFonts w:ascii="Georgia" w:hAnsi="Georgia" w:cs="SBL Hebrew" w:eastAsia="Georgia"/>
+          <w:b w:val="0"/>
+          <w:i w:val="0"/>
+          <w:color w:val="1A1A1A"/>
+          <w:sz w:val="21"/>
+        </w:rPr>
+        <w:t xml:space="preserve"> 24:16 — </w:t>
+      </w:r>
+      <w:r>
+        <w:rPr>
+          <w:rFonts w:ascii="SBL Hebrew" w:hAnsi="SBL Hebrew" w:cs="SBL Hebrew" w:eastAsia="SBL Hebrew"/>
+          <w:b w:val="0"/>
+          <w:i w:val="0"/>
+          <w:color w:val="1E3A8A"/>
+          <w:sz w:val="21"/>
+        </w:rPr>
+        <w:t>מִכְּנַף הָאָרֶץ זְמִרֹת שָׁמַעְנוּ</w:t>
+      </w:r>
+      <w:r>
+        <w:rPr>
+          <w:rFonts w:ascii="Georgia" w:hAnsi="Georgia" w:cs="SBL Hebrew" w:eastAsia="Georgia"/>
+          <w:b w:val="0"/>
+          <w:i w:val="0"/>
+          <w:color w:val="1A1A1A"/>
+          <w:sz w:val="21"/>
+        </w:rPr>
+        <w:t xml:space="preserve"> — the song from the “wing of the earth” supplied by </w:t>
+      </w:r>
+      <w:r>
+        <w:rPr>
+          <w:rFonts w:ascii="Georgia" w:hAnsi="Georgia" w:cs="SBL Hebrew" w:eastAsia="Georgia"/>
+          <w:b w:val="0"/>
+          <w:i/>
+          <w:color w:val="1A1A1A"/>
+          <w:sz w:val="21"/>
+        </w:rPr>
+        <w:t>Klal Yisrael</w:t>
+      </w:r>
+      <w:r>
+        <w:rPr>
+          <w:rFonts w:ascii="Georgia" w:hAnsi="Georgia" w:cs="SBL Hebrew" w:eastAsia="Georgia"/>
+          <w:b w:val="0"/>
+          <w:i w:val="0"/>
+          <w:color w:val="1A1A1A"/>
+          <w:sz w:val="21"/>
+        </w:rPr>
+        <w:t xml:space="preserve">. The added </w:t>
       </w:r>
       <w:r>
         <w:rPr>

</xml_diff>